<commit_message>
Formatting changes, and new instructions for exterior triangles.
</commit_message>
<xml_diff>
--- a/Exterior_Trim/exterior_trim.docx
+++ b/Exterior_Trim/exterior_trim.docx
@@ -2,7 +2,7 @@
 <file path=word/document.xml><?xml version="1.0" encoding="utf-8"?>
 <w:document xmlns:w="http://schemas.openxmlformats.org/wordprocessingml/2006/main" xmlns:m="http://schemas.openxmlformats.org/officeDocument/2006/math" xmlns:r="http://schemas.openxmlformats.org/officeDocument/2006/relationships" xmlns:o="urn:schemas-microsoft-com:office:office" xmlns:v="urn:schemas-microsoft-com:vml" xmlns:w10="urn:schemas-microsoft-com:office:word" xmlns:a="http://schemas.openxmlformats.org/drawingml/2006/main" xmlns:pic="http://schemas.openxmlformats.org/drawingml/2006/picture" xmlns:wp="http://schemas.openxmlformats.org/drawingml/2006/wordprocessingDrawing">
   <w:body>
-    <w:bookmarkStart w:id="25" w:name="corner-trim-installation"/>
+    <w:bookmarkStart w:id="28" w:name="corner-trim-installation"/>
     <w:p>
       <w:pPr>
         <w:pStyle w:val="Heading1"/>
@@ -31,7 +31,7 @@
         <w:t xml:space="preserve">sidewall paneling.</w:t>
       </w:r>
     </w:p>
-    <w:bookmarkStart w:id="20" w:name="step-1-board-1"/>
+    <w:bookmarkStart w:id="23" w:name="step-1-board-1"/>
     <w:p>
       <w:pPr>
         <w:pStyle w:val="Heading2"/>
@@ -142,87 +142,9 @@
         <w:t xml:space="preserve">— 2 nails about 2ˮ from the bottom</w:t>
       </w:r>
     </w:p>
-    <w:bookmarkEnd w:id="20"/>
-    <w:bookmarkStart w:id="24" w:name="step-2-board-2"/>
-    <w:p>
-      <w:pPr>
-        <w:pStyle w:val="Heading2"/>
-      </w:pPr>
-      <w:r>
-        <w:t xml:space="preserve">Step 2 – Board #2</w:t>
-      </w:r>
-    </w:p>
-    <w:p>
-      <w:pPr>
-        <w:numPr>
-          <w:ilvl w:val="0"/>
-          <w:numId w:val="1002"/>
-        </w:numPr>
-      </w:pPr>
-      <w:r>
-        <w:t xml:space="preserve">Use white or gray 1x4 boards, precut to 93¼ˮ.</w:t>
-      </w:r>
-    </w:p>
-    <w:p>
-      <w:pPr>
-        <w:numPr>
-          <w:ilvl w:val="0"/>
-          <w:numId w:val="1002"/>
-        </w:numPr>
-      </w:pPr>
-      <w:r>
-        <w:t xml:space="preserve">Put EXTERIOR caulk as shown, and flip board so that caulk will be against the end wall.</w:t>
-      </w:r>
-    </w:p>
-    <w:p>
-      <w:pPr>
-        <w:numPr>
-          <w:ilvl w:val="0"/>
-          <w:numId w:val="1002"/>
-        </w:numPr>
-      </w:pPr>
-      <w:r>
-        <w:t xml:space="preserve">Line up the bottom of board with the bottom of Board #1.</w:t>
-      </w:r>
-    </w:p>
-    <w:p>
-      <w:pPr>
-        <w:numPr>
-          <w:ilvl w:val="0"/>
-          <w:numId w:val="1002"/>
-        </w:numPr>
-      </w:pPr>
-      <w:r>
-        <w:t xml:space="preserve">Starting at the top (use alignment block) to line up outside (corner) edge of the Board #2 with the surface of Board #1, nail (PANEL NAILS)</w:t>
-      </w:r>
-      <w:r>
-        <w:br/>
-      </w:r>
-      <w:r>
-        <w:t xml:space="preserve">— 2 nails about 2ˮ from top</w:t>
-      </w:r>
-      <w:r>
-        <w:br/>
-      </w:r>
-      <w:r>
-        <w:t xml:space="preserve">— 1 nail every 8ˮ down the middle</w:t>
-      </w:r>
-      <w:r>
-        <w:br/>
-      </w:r>
-      <w:r>
-        <w:t xml:space="preserve">— 2 nails about 2ˮ from the bottom.</w:t>
-      </w:r>
-    </w:p>
-    <w:p>
-      <w:pPr>
-        <w:numPr>
-          <w:ilvl w:val="0"/>
-          <w:numId w:val="1002"/>
-        </w:numPr>
-      </w:pPr>
-      <w:r>
-        <w:t xml:space="preserve">Repeat for the other three corners of the home.</w:t>
+    <w:p>
+      <w:r>
+        <w:br w:type="page"/>
       </w:r>
     </w:p>
     <w:p>
@@ -234,18 +156,18 @@
           <wp:inline>
             <wp:extent cx="5943600" cy="8229600"/>
             <wp:effectExtent b="0" l="0" r="0" t="0"/>
-            <wp:docPr descr="" title="" id="22" name="Picture"/>
+            <wp:docPr descr="" title="" id="21" name="Picture"/>
             <a:graphic>
               <a:graphicData uri="http://schemas.openxmlformats.org/drawingml/2006/picture">
                 <pic:pic>
                   <pic:nvPicPr>
-                    <pic:cNvPr descr="images/back_corner.png" id="23" name="Picture"/>
+                    <pic:cNvPr descr="images/back_corner_1.png" id="22" name="Picture"/>
                     <pic:cNvPicPr>
                       <a:picLocks noChangeArrowheads="1" noChangeAspect="1"/>
                     </pic:cNvPicPr>
                   </pic:nvPicPr>
                   <pic:blipFill>
-                    <a:blip r:embed="rId21"/>
+                    <a:blip r:embed="rId20"/>
                     <a:stretch>
                       <a:fillRect/>
                     </a:stretch>
@@ -272,199 +194,87 @@
         </w:drawing>
       </w:r>
     </w:p>
-    <w:bookmarkEnd w:id="24"/>
-    <w:bookmarkEnd w:id="25"/>
-    <w:bookmarkStart w:id="32" w:name="rear-window"/>
-    <w:p>
-      <w:pPr>
-        <w:pStyle w:val="Heading1"/>
-      </w:pPr>
-      <w:r>
-        <w:t xml:space="preserve">REAR WINDOW</w:t>
-      </w:r>
-    </w:p>
-    <w:bookmarkStart w:id="26" w:name="step-1-2-side-trim-pieces"/>
+    <w:bookmarkEnd w:id="23"/>
+    <w:bookmarkStart w:id="27" w:name="step-2-board-2"/>
     <w:p>
       <w:pPr>
         <w:pStyle w:val="Heading2"/>
       </w:pPr>
       <w:r>
-        <w:t xml:space="preserve">Step 1 &amp; 2 – Side Trim Pieces</w:t>
-      </w:r>
-    </w:p>
-    <w:p>
-      <w:pPr>
-        <w:numPr>
-          <w:ilvl w:val="0"/>
-          <w:numId w:val="1003"/>
-        </w:numPr>
-      </w:pPr>
-      <w:r>
-        <w:t xml:space="preserve">Using precut side pieces, put EXTERIOR caulk as shown.</w:t>
-      </w:r>
-    </w:p>
-    <w:p>
-      <w:pPr>
-        <w:numPr>
-          <w:ilvl w:val="0"/>
-          <w:numId w:val="1003"/>
-        </w:numPr>
-      </w:pPr>
-      <w:r>
-        <w:t xml:space="preserve">Place side piece snug up against the window. Use a block to align</w:t>
-      </w:r>
-      <w:r>
-        <w:t xml:space="preserve"> </w:t>
-      </w:r>
-      <w:r>
-        <w:t xml:space="preserve">the top of each piece with the top of the window.</w:t>
-      </w:r>
-    </w:p>
-    <w:p>
-      <w:pPr>
-        <w:numPr>
-          <w:ilvl w:val="0"/>
-          <w:numId w:val="1003"/>
-        </w:numPr>
-      </w:pPr>
-      <w:r>
-        <w:t xml:space="preserve">Nail (PANEL NAILS)</w:t>
-      </w:r>
-      <w:r>
-        <w:br/>
-      </w:r>
-      <w:r>
-        <w:t xml:space="preserve">— 2 nails 1-½” below top</w:t>
-      </w:r>
-      <w:r>
-        <w:t xml:space="preserve"> </w:t>
-      </w:r>
-      <w:r>
-        <w:t xml:space="preserve">— 1 nail in the middle of the board every 8”</w:t>
-      </w:r>
-      <w:r>
-        <w:br/>
-      </w:r>
-      <w:r>
-        <w:t xml:space="preserve">— 2 nails 1-½” above the bottom.</w:t>
-      </w:r>
-    </w:p>
-    <w:bookmarkEnd w:id="26"/>
-    <w:bookmarkStart w:id="27" w:name="step-3-top-piece"/>
-    <w:p>
-      <w:pPr>
-        <w:pStyle w:val="Heading2"/>
-      </w:pPr>
-      <w:r>
-        <w:t xml:space="preserve">Step 3 – Top Piece</w:t>
-      </w:r>
-    </w:p>
-    <w:p>
-      <w:pPr>
-        <w:numPr>
-          <w:ilvl w:val="0"/>
-          <w:numId w:val="1004"/>
-        </w:numPr>
-      </w:pPr>
-      <w:r>
-        <w:t xml:space="preserve">Measure from outside edge to outside edge of side trim and add ½ˮ</w:t>
-      </w:r>
-    </w:p>
-    <w:p>
-      <w:pPr>
-        <w:numPr>
-          <w:ilvl w:val="0"/>
-          <w:numId w:val="1004"/>
-        </w:numPr>
-      </w:pPr>
-      <w:r>
-        <w:t xml:space="preserve">Check that the precut beveled-edge piece is that length. Trim if it is not.</w:t>
-      </w:r>
-    </w:p>
-    <w:p>
-      <w:pPr>
-        <w:numPr>
-          <w:ilvl w:val="0"/>
-          <w:numId w:val="1004"/>
-        </w:numPr>
-      </w:pPr>
-      <w:r>
-        <w:t xml:space="preserve">Put EXTERIOR caulk, as shown, near the beveled edge and at both</w:t>
-      </w:r>
-      <w:r>
-        <w:t xml:space="preserve"> </w:t>
-      </w:r>
-      <w:r>
-        <w:t xml:space="preserve">ends.</w:t>
-      </w:r>
-    </w:p>
-    <w:p>
-      <w:pPr>
-        <w:numPr>
-          <w:ilvl w:val="0"/>
-          <w:numId w:val="1004"/>
-        </w:numPr>
-      </w:pPr>
-      <w:r>
-        <w:t xml:space="preserve">Position with right edge flush with side trim. Nail (PANEL NAILS)</w:t>
-      </w:r>
-      <w:r>
-        <w:br/>
-      </w:r>
-      <w:r>
-        <w:t xml:space="preserve">— 2 nails 1-½” in from each end</w:t>
-      </w:r>
-      <w:r>
-        <w:br/>
-      </w:r>
-      <w:r>
-        <w:t xml:space="preserve">— 2 nails in the middle of the board.</w:t>
-      </w:r>
-    </w:p>
-    <w:bookmarkEnd w:id="27"/>
-    <w:bookmarkStart w:id="31" w:name="step-4-bottom-piece"/>
-    <w:p>
-      <w:pPr>
-        <w:pStyle w:val="Heading2"/>
-      </w:pPr>
-      <w:r>
-        <w:t xml:space="preserve">Step 4 – Bottom Piece</w:t>
-      </w:r>
-    </w:p>
-    <w:p>
-      <w:pPr>
-        <w:pStyle w:val="Compact"/>
-        <w:numPr>
-          <w:ilvl w:val="0"/>
-          <w:numId w:val="1005"/>
-        </w:numPr>
-      </w:pPr>
-      <w:r>
-        <w:t xml:space="preserve">Measure between the 2 side pieces under the window, and cut a piece of 1x4 that length.</w:t>
-      </w:r>
-    </w:p>
-    <w:p>
-      <w:pPr>
-        <w:pStyle w:val="Compact"/>
-        <w:numPr>
-          <w:ilvl w:val="0"/>
-          <w:numId w:val="1005"/>
-        </w:numPr>
-      </w:pPr>
-      <w:r>
-        <w:t xml:space="preserve">DO NOT caulk this piece. Nail (PANEL NAILS) it in place</w:t>
-      </w:r>
-      <w:r>
-        <w:br/>
-      </w:r>
-      <w:r>
-        <w:t xml:space="preserve">— 2 nails 1-½” in from each end</w:t>
-      </w:r>
-      <w:r>
-        <w:br/>
-      </w:r>
-      <w:r>
-        <w:t xml:space="preserve">— 2 nails in the middle of the board.</w:t>
+        <w:t xml:space="preserve">Step 2 – Board #2</w:t>
+      </w:r>
+    </w:p>
+    <w:p>
+      <w:pPr>
+        <w:numPr>
+          <w:ilvl w:val="0"/>
+          <w:numId w:val="1002"/>
+        </w:numPr>
+      </w:pPr>
+      <w:r>
+        <w:t xml:space="preserve">Use white or gray 1x4 boards, precut to 93¼ˮ.</w:t>
+      </w:r>
+    </w:p>
+    <w:p>
+      <w:pPr>
+        <w:numPr>
+          <w:ilvl w:val="0"/>
+          <w:numId w:val="1002"/>
+        </w:numPr>
+      </w:pPr>
+      <w:r>
+        <w:t xml:space="preserve">Put EXTERIOR caulk as shown, and flip board so that caulk will be against the end wall.</w:t>
+      </w:r>
+    </w:p>
+    <w:p>
+      <w:pPr>
+        <w:numPr>
+          <w:ilvl w:val="0"/>
+          <w:numId w:val="1002"/>
+        </w:numPr>
+      </w:pPr>
+      <w:r>
+        <w:t xml:space="preserve">Line up the bottom of board with the bottom of Board #1.</w:t>
+      </w:r>
+    </w:p>
+    <w:p>
+      <w:pPr>
+        <w:numPr>
+          <w:ilvl w:val="0"/>
+          <w:numId w:val="1002"/>
+        </w:numPr>
+      </w:pPr>
+      <w:r>
+        <w:t xml:space="preserve">Starting at the top (use alignment block) to line up outside (corner) edge of the Board #2 with the surface of Board #1, nail (PANEL NAILS)</w:t>
+      </w:r>
+      <w:r>
+        <w:br/>
+      </w:r>
+      <w:r>
+        <w:t xml:space="preserve">— 2 nails about 2ˮ from top</w:t>
+      </w:r>
+      <w:r>
+        <w:br/>
+      </w:r>
+      <w:r>
+        <w:t xml:space="preserve">— 1 nail every 8ˮ down the middle</w:t>
+      </w:r>
+      <w:r>
+        <w:br/>
+      </w:r>
+      <w:r>
+        <w:t xml:space="preserve">— 2 nails about 2ˮ from the bottom.</w:t>
+      </w:r>
+    </w:p>
+    <w:p>
+      <w:pPr>
+        <w:numPr>
+          <w:ilvl w:val="0"/>
+          <w:numId w:val="1002"/>
+        </w:numPr>
+      </w:pPr>
+      <w:r>
+        <w:t xml:space="preserve">Repeat for the other three corners of the home. Note that on two of those corners, the caulking will be a mirror image of that shown.</w:t>
       </w:r>
     </w:p>
     <w:p>
@@ -481,18 +291,18 @@
           <wp:inline>
             <wp:extent cx="5943600" cy="8229600"/>
             <wp:effectExtent b="0" l="0" r="0" t="0"/>
-            <wp:docPr descr="" title="" id="29" name="Picture"/>
+            <wp:docPr descr="" title="" id="25" name="Picture"/>
             <a:graphic>
               <a:graphicData uri="http://schemas.openxmlformats.org/drawingml/2006/picture">
                 <pic:pic>
                   <pic:nvPicPr>
-                    <pic:cNvPr descr="images/rear_window.png" id="30" name="Picture"/>
+                    <pic:cNvPr descr="images/back_corner_2.png" id="26" name="Picture"/>
                     <pic:cNvPicPr>
                       <a:picLocks noChangeArrowheads="1" noChangeAspect="1"/>
                     </pic:cNvPicPr>
                   </pic:nvPicPr>
                   <pic:blipFill>
-                    <a:blip r:embed="rId28"/>
+                    <a:blip r:embed="rId24"/>
                     <a:stretch>
                       <a:fillRect/>
                     </a:stretch>
@@ -519,36 +329,163 @@
         </w:drawing>
       </w:r>
     </w:p>
-    <w:bookmarkEnd w:id="31"/>
-    <w:bookmarkEnd w:id="32"/>
-    <w:bookmarkStart w:id="40" w:name="front-window-trim"/>
+    <w:bookmarkEnd w:id="27"/>
+    <w:bookmarkEnd w:id="28"/>
+    <w:bookmarkStart w:id="35" w:name="rear-window"/>
     <w:p>
       <w:pPr>
         <w:pStyle w:val="Heading1"/>
       </w:pPr>
       <w:r>
-        <w:t xml:space="preserve">FRONT WINDOW TRIM</w:t>
-      </w:r>
-    </w:p>
-    <w:p>
-      <w:pPr>
-        <w:pStyle w:val="FirstParagraph"/>
-      </w:pPr>
-      <w:r>
-        <w:rPr>
-          <w:b/>
-          <w:bCs/>
-        </w:rPr>
-        <w:t xml:space="preserve">Do not install this trim until the door is in place!</w:t>
-      </w:r>
-    </w:p>
-    <w:bookmarkStart w:id="33" w:name="step-1----top-trim"/>
+        <w:t xml:space="preserve">REAR WINDOW</w:t>
+      </w:r>
+    </w:p>
+    <w:bookmarkStart w:id="29" w:name="step-1-2-side-trim-pieces"/>
     <w:p>
       <w:pPr>
         <w:pStyle w:val="Heading2"/>
       </w:pPr>
       <w:r>
-        <w:t xml:space="preserve">Step 1 -- Top trim</w:t>
+        <w:t xml:space="preserve">Step 1 &amp; 2 – Side Trim Pieces</w:t>
+      </w:r>
+    </w:p>
+    <w:p>
+      <w:pPr>
+        <w:numPr>
+          <w:ilvl w:val="0"/>
+          <w:numId w:val="1003"/>
+        </w:numPr>
+      </w:pPr>
+      <w:r>
+        <w:t xml:space="preserve">Using precut side pieces, put EXTERIOR caulk as shown.</w:t>
+      </w:r>
+    </w:p>
+    <w:p>
+      <w:pPr>
+        <w:numPr>
+          <w:ilvl w:val="0"/>
+          <w:numId w:val="1003"/>
+        </w:numPr>
+      </w:pPr>
+      <w:r>
+        <w:t xml:space="preserve">Place side piece snug up against the window. Use a block to align</w:t>
+      </w:r>
+      <w:r>
+        <w:t xml:space="preserve"> </w:t>
+      </w:r>
+      <w:r>
+        <w:t xml:space="preserve">the top of each piece with the top of the window.</w:t>
+      </w:r>
+    </w:p>
+    <w:p>
+      <w:pPr>
+        <w:numPr>
+          <w:ilvl w:val="0"/>
+          <w:numId w:val="1003"/>
+        </w:numPr>
+      </w:pPr>
+      <w:r>
+        <w:t xml:space="preserve">Nail (PANEL NAILS)</w:t>
+      </w:r>
+      <w:r>
+        <w:br/>
+      </w:r>
+      <w:r>
+        <w:t xml:space="preserve">— 2 nails 1-½” below top</w:t>
+      </w:r>
+      <w:r>
+        <w:t xml:space="preserve"> </w:t>
+      </w:r>
+      <w:r>
+        <w:t xml:space="preserve">— 1 nail in the middle of the board every 8”</w:t>
+      </w:r>
+      <w:r>
+        <w:br/>
+      </w:r>
+      <w:r>
+        <w:t xml:space="preserve">— 2 nails 1-½” above the bottom.</w:t>
+      </w:r>
+    </w:p>
+    <w:bookmarkEnd w:id="29"/>
+    <w:bookmarkStart w:id="30" w:name="step-3-top-piece"/>
+    <w:p>
+      <w:pPr>
+        <w:pStyle w:val="Heading2"/>
+      </w:pPr>
+      <w:r>
+        <w:t xml:space="preserve">Step 3 – Top Piece</w:t>
+      </w:r>
+    </w:p>
+    <w:p>
+      <w:pPr>
+        <w:numPr>
+          <w:ilvl w:val="0"/>
+          <w:numId w:val="1004"/>
+        </w:numPr>
+      </w:pPr>
+      <w:r>
+        <w:t xml:space="preserve">Measure from outside edge to outside edge of side trim and add ½ˮ</w:t>
+      </w:r>
+    </w:p>
+    <w:p>
+      <w:pPr>
+        <w:numPr>
+          <w:ilvl w:val="0"/>
+          <w:numId w:val="1004"/>
+        </w:numPr>
+      </w:pPr>
+      <w:r>
+        <w:t xml:space="preserve">Check that the precut beveled-edge piece is that length. Trim if it is not.</w:t>
+      </w:r>
+    </w:p>
+    <w:p>
+      <w:pPr>
+        <w:numPr>
+          <w:ilvl w:val="0"/>
+          <w:numId w:val="1004"/>
+        </w:numPr>
+      </w:pPr>
+      <w:r>
+        <w:t xml:space="preserve">Put EXTERIOR caulk, as shown, near the beveled edge and at both</w:t>
+      </w:r>
+      <w:r>
+        <w:t xml:space="preserve"> </w:t>
+      </w:r>
+      <w:r>
+        <w:t xml:space="preserve">ends.</w:t>
+      </w:r>
+    </w:p>
+    <w:p>
+      <w:pPr>
+        <w:numPr>
+          <w:ilvl w:val="0"/>
+          <w:numId w:val="1004"/>
+        </w:numPr>
+      </w:pPr>
+      <w:r>
+        <w:t xml:space="preserve">Position with right edge flush with side trim. Nail (PANEL NAILS)</w:t>
+      </w:r>
+      <w:r>
+        <w:br/>
+      </w:r>
+      <w:r>
+        <w:t xml:space="preserve">— 2 nails 1-½” in from each end</w:t>
+      </w:r>
+      <w:r>
+        <w:br/>
+      </w:r>
+      <w:r>
+        <w:t xml:space="preserve">— 2 nails in the middle of the board.</w:t>
+      </w:r>
+    </w:p>
+    <w:bookmarkEnd w:id="30"/>
+    <w:bookmarkStart w:id="34" w:name="step-4-bottom-piece"/>
+    <w:p>
+      <w:pPr>
+        <w:pStyle w:val="Heading2"/>
+      </w:pPr>
+      <w:r>
+        <w:t xml:space="preserve">Step 4 – Bottom Piece</w:t>
       </w:r>
     </w:p>
     <w:p>
@@ -556,29 +493,11 @@
         <w:pStyle w:val="Compact"/>
         <w:numPr>
           <w:ilvl w:val="0"/>
-          <w:numId w:val="1006"/>
-        </w:numPr>
-      </w:pPr>
-      <w:r>
-        <w:t xml:space="preserve">Using a small piece of 1x4 placed vertically beside the window side</w:t>
-      </w:r>
-      <w:r>
-        <w:t xml:space="preserve"> </w:t>
-      </w:r>
-      <w:r>
-        <w:t xml:space="preserve">furthest from the door, measure from the mark to the door trim</w:t>
-      </w:r>
-      <w:r>
-        <w:br/>
-      </w:r>
-      <w:r>
-        <w:t xml:space="preserve">— Add ½”, and cut a piece of top trim (with beveled edge) to this length</w:t>
-      </w:r>
-      <w:r>
-        <w:br/>
-      </w:r>
-      <w:r>
-        <w:t xml:space="preserve">— Apply EXTERIOR caulk as shown</w:t>
+          <w:numId w:val="1005"/>
+        </w:numPr>
+      </w:pPr>
+      <w:r>
+        <w:t xml:space="preserve">Measure between the 2 side pieces under the window, and cut a piece of 1x4 that length.</w:t>
       </w:r>
     </w:p>
     <w:p>
@@ -586,11 +505,11 @@
         <w:pStyle w:val="Compact"/>
         <w:numPr>
           <w:ilvl w:val="0"/>
-          <w:numId w:val="1006"/>
-        </w:numPr>
-      </w:pPr>
-      <w:r>
-        <w:t xml:space="preserve">Nail (PANEL NAILS)</w:t>
+          <w:numId w:val="1005"/>
+        </w:numPr>
+      </w:pPr>
+      <w:r>
+        <w:t xml:space="preserve">DO NOT caulk this piece. Nail (PANEL NAILS) it in place</w:t>
       </w:r>
       <w:r>
         <w:br/>
@@ -605,128 +524,9 @@
         <w:t xml:space="preserve">— 2 nails in the middle of the board.</w:t>
       </w:r>
     </w:p>
-    <w:bookmarkEnd w:id="33"/>
-    <w:bookmarkStart w:id="34" w:name="step-2----side-trim-away-from-door"/>
-    <w:p>
-      <w:pPr>
-        <w:pStyle w:val="Heading2"/>
-      </w:pPr>
-      <w:r>
-        <w:t xml:space="preserve">Step 2 -- Side trim away from door</w:t>
-      </w:r>
-    </w:p>
-    <w:p>
-      <w:pPr>
-        <w:pStyle w:val="Compact"/>
-        <w:numPr>
-          <w:ilvl w:val="0"/>
-          <w:numId w:val="1007"/>
-        </w:numPr>
-      </w:pPr>
-      <w:r>
-        <w:t xml:space="preserve">Using a pre-cut side trim piece for side of window away from door</w:t>
-      </w:r>
-    </w:p>
-    <w:p>
-      <w:pPr>
-        <w:pStyle w:val="Compact"/>
-        <w:numPr>
-          <w:ilvl w:val="0"/>
-          <w:numId w:val="1007"/>
-        </w:numPr>
-      </w:pPr>
-      <w:r>
-        <w:t xml:space="preserve">Apply EXTERIOR caulk as shown</w:t>
-      </w:r>
-    </w:p>
-    <w:p>
-      <w:pPr>
-        <w:pStyle w:val="Compact"/>
-        <w:numPr>
-          <w:ilvl w:val="0"/>
-          <w:numId w:val="1007"/>
-        </w:numPr>
-      </w:pPr>
-      <w:r>
-        <w:t xml:space="preserve">2 nails 1-½” below top</w:t>
-      </w:r>
-      <w:r>
-        <w:br/>
-      </w:r>
-      <w:r>
-        <w:t xml:space="preserve">— 1 nail in the middle of the board every 8”</w:t>
-      </w:r>
-      <w:r>
-        <w:br/>
-      </w:r>
-      <w:r>
-        <w:t xml:space="preserve">— 2 nails 1-½” above the bottom.</w:t>
-      </w:r>
-    </w:p>
-    <w:bookmarkEnd w:id="34"/>
-    <w:bookmarkStart w:id="35" w:name="X5ffa5d7bf4c6086ec0e57d6f2c8498a77ce06e8"/>
-    <w:p>
-      <w:pPr>
-        <w:pStyle w:val="Heading2"/>
-      </w:pPr>
-      <w:r>
-        <w:t xml:space="preserve">Step 3 -- Side trim between window and door</w:t>
-      </w:r>
-    </w:p>
-    <w:p>
-      <w:pPr>
-        <w:pStyle w:val="Compact"/>
-        <w:numPr>
-          <w:ilvl w:val="0"/>
-          <w:numId w:val="1008"/>
-        </w:numPr>
-      </w:pPr>
-      <w:r>
-        <w:t xml:space="preserve">Apply EXTERIOR caulk down the middle. Center and nail as above.</w:t>
-      </w:r>
-    </w:p>
-    <w:bookmarkEnd w:id="35"/>
-    <w:bookmarkStart w:id="39" w:name="step-4----bottom-piece"/>
-    <w:p>
-      <w:pPr>
-        <w:pStyle w:val="Heading2"/>
-      </w:pPr>
-      <w:r>
-        <w:t xml:space="preserve">Step 4 -- Bottom piece</w:t>
-      </w:r>
-    </w:p>
-    <w:p>
-      <w:pPr>
-        <w:numPr>
-          <w:ilvl w:val="0"/>
-          <w:numId w:val="1009"/>
-        </w:numPr>
-      </w:pPr>
-      <w:r>
-        <w:t xml:space="preserve">Measure between the two side pieces under the window, and cut a piece of 1x4 that length</w:t>
-      </w:r>
-    </w:p>
-    <w:p>
-      <w:pPr>
-        <w:numPr>
-          <w:ilvl w:val="0"/>
-          <w:numId w:val="1009"/>
-        </w:numPr>
-      </w:pPr>
-      <w:r>
-        <w:t xml:space="preserve">DO NOT CAULK this piece. Nail (PANEL NAILS) it in place</w:t>
-      </w:r>
-      <w:r>
-        <w:br/>
-      </w:r>
-      <w:r>
-        <w:t xml:space="preserve">— 2 nails 1-½” in from each end</w:t>
-      </w:r>
-      <w:r>
-        <w:br/>
-      </w:r>
-      <w:r>
-        <w:t xml:space="preserve">— 2 nails in the middle of the board</w:t>
+    <w:p>
+      <w:r>
+        <w:br w:type="page"/>
       </w:r>
     </w:p>
     <w:p>
@@ -738,18 +538,18 @@
           <wp:inline>
             <wp:extent cx="5943600" cy="8229600"/>
             <wp:effectExtent b="0" l="0" r="0" t="0"/>
-            <wp:docPr descr="" title="" id="37" name="Picture"/>
+            <wp:docPr descr="" title="" id="32" name="Picture"/>
             <a:graphic>
               <a:graphicData uri="http://schemas.openxmlformats.org/drawingml/2006/picture">
                 <pic:pic>
                   <pic:nvPicPr>
-                    <pic:cNvPr descr="images/front_window.png" id="38" name="Picture"/>
+                    <pic:cNvPr descr="images/rear_window.png" id="33" name="Picture"/>
                     <pic:cNvPicPr>
                       <a:picLocks noChangeArrowheads="1" noChangeAspect="1"/>
                     </pic:cNvPicPr>
                   </pic:nvPicPr>
                   <pic:blipFill>
-                    <a:blip r:embed="rId36"/>
+                    <a:blip r:embed="rId31"/>
                     <a:stretch>
                       <a:fillRect/>
                     </a:stretch>
@@ -776,15 +576,15 @@
         </w:drawing>
       </w:r>
     </w:p>
-    <w:bookmarkEnd w:id="39"/>
-    <w:bookmarkEnd w:id="40"/>
-    <w:bookmarkStart w:id="52" w:name="exterior-triangles---front-back"/>
+    <w:bookmarkEnd w:id="34"/>
+    <w:bookmarkEnd w:id="35"/>
+    <w:bookmarkStart w:id="43" w:name="front-window-trim"/>
     <w:p>
       <w:pPr>
         <w:pStyle w:val="Heading1"/>
       </w:pPr>
       <w:r>
-        <w:t xml:space="preserve">EXTERIOR TRIANGLES - FRONT &amp; BACK</w:t>
+        <w:t xml:space="preserve">FRONT WINDOW TRIM</w:t>
       </w:r>
     </w:p>
     <w:p>
@@ -792,16 +592,20 @@
         <w:pStyle w:val="FirstParagraph"/>
       </w:pPr>
       <w:r>
-        <w:t xml:space="preserve">NOTE - Pre-cut Tyvek, metal flashing and triangle siding are on the back shelves near the white boards.</w:t>
-      </w:r>
-    </w:p>
-    <w:bookmarkStart w:id="41" w:name="step-1---tyvek"/>
+        <w:rPr>
+          <w:b/>
+          <w:bCs/>
+        </w:rPr>
+        <w:t xml:space="preserve">Do not install this trim until the door is in place!</w:t>
+      </w:r>
+    </w:p>
+    <w:bookmarkStart w:id="36" w:name="step-1----top-trim"/>
     <w:p>
       <w:pPr>
         <w:pStyle w:val="Heading2"/>
       </w:pPr>
       <w:r>
-        <w:t xml:space="preserve">Step 1 - Tyvek</w:t>
+        <w:t xml:space="preserve">Step 1 -- Top trim</w:t>
       </w:r>
     </w:p>
     <w:p>
@@ -809,11 +613,29 @@
         <w:pStyle w:val="Compact"/>
         <w:numPr>
           <w:ilvl w:val="0"/>
-          <w:numId w:val="1010"/>
-        </w:numPr>
-      </w:pPr>
-      <w:r>
-        <w:t xml:space="preserve">Staple pre-cut Tyvek triangles to the structural triangle.</w:t>
+          <w:numId w:val="1006"/>
+        </w:numPr>
+      </w:pPr>
+      <w:r>
+        <w:t xml:space="preserve">Using a small piece of 1x4 placed vertically beside the window side</w:t>
+      </w:r>
+      <w:r>
+        <w:t xml:space="preserve"> </w:t>
+      </w:r>
+      <w:r>
+        <w:t xml:space="preserve">furthest from the door, measure from the mark to the door trim</w:t>
+      </w:r>
+      <w:r>
+        <w:br/>
+      </w:r>
+      <w:r>
+        <w:t xml:space="preserve">— Add ½”, and cut a piece of top trim (with beveled edge) to this length</w:t>
+      </w:r>
+      <w:r>
+        <w:br/>
+      </w:r>
+      <w:r>
+        <w:t xml:space="preserve">— Apply EXTERIOR caulk as shown</w:t>
       </w:r>
     </w:p>
     <w:p>
@@ -821,21 +643,33 @@
         <w:pStyle w:val="Compact"/>
         <w:numPr>
           <w:ilvl w:val="0"/>
-          <w:numId w:val="1010"/>
-        </w:numPr>
-      </w:pPr>
-      <w:r>
-        <w:t xml:space="preserve">Staple along top and bottom edges and down the center studs; hammer in all staples flush.</w:t>
-      </w:r>
-    </w:p>
-    <w:bookmarkEnd w:id="41"/>
-    <w:bookmarkStart w:id="42" w:name="step-2---z-flashing"/>
+          <w:numId w:val="1006"/>
+        </w:numPr>
+      </w:pPr>
+      <w:r>
+        <w:t xml:space="preserve">Nail (PANEL NAILS)</w:t>
+      </w:r>
+      <w:r>
+        <w:br/>
+      </w:r>
+      <w:r>
+        <w:t xml:space="preserve">— 2 nails 1-½” in from each end</w:t>
+      </w:r>
+      <w:r>
+        <w:br/>
+      </w:r>
+      <w:r>
+        <w:t xml:space="preserve">— 2 nails in the middle of the board.</w:t>
+      </w:r>
+    </w:p>
+    <w:bookmarkEnd w:id="36"/>
+    <w:bookmarkStart w:id="37" w:name="step-2----side-trim-away-from-door"/>
     <w:p>
       <w:pPr>
         <w:pStyle w:val="Heading2"/>
       </w:pPr>
       <w:r>
-        <w:t xml:space="preserve">Step 2 - Z-Flashing</w:t>
+        <w:t xml:space="preserve">Step 2 -- Side trim away from door</w:t>
       </w:r>
     </w:p>
     <w:p>
@@ -843,17 +677,11 @@
         <w:pStyle w:val="Compact"/>
         <w:numPr>
           <w:ilvl w:val="0"/>
-          <w:numId w:val="1011"/>
-        </w:numPr>
-      </w:pPr>
-      <w:r>
-        <w:t xml:space="preserve">Install pre-cut piece of metal flashing</w:t>
-      </w:r>
-      <w:r>
-        <w:br/>
-      </w:r>
-      <w:r>
-        <w:t xml:space="preserve">— short leg down so that flashing rests on top of the T1-11 siding at the top of the wall and the short leg extends down over the siding</w:t>
+          <w:numId w:val="1007"/>
+        </w:numPr>
+      </w:pPr>
+      <w:r>
+        <w:t xml:space="preserve">Using a pre-cut side trim piece for side of window away from door</w:t>
       </w:r>
     </w:p>
     <w:p>
@@ -861,11 +689,11 @@
         <w:pStyle w:val="Compact"/>
         <w:numPr>
           <w:ilvl w:val="0"/>
-          <w:numId w:val="1011"/>
-        </w:numPr>
-      </w:pPr>
-      <w:r>
-        <w:t xml:space="preserve">Center the flashing between the rafter ends</w:t>
+          <w:numId w:val="1007"/>
+        </w:numPr>
+      </w:pPr>
+      <w:r>
+        <w:t xml:space="preserve">Apply EXTERIOR caulk as shown</w:t>
       </w:r>
     </w:p>
     <w:p>
@@ -873,21 +701,33 @@
         <w:pStyle w:val="Compact"/>
         <w:numPr>
           <w:ilvl w:val="0"/>
-          <w:numId w:val="1011"/>
-        </w:numPr>
-      </w:pPr>
-      <w:r>
-        <w:t xml:space="preserve">Nail (PANEL NAILS) 3 places: near each end, and in middle</w:t>
-      </w:r>
-    </w:p>
-    <w:bookmarkEnd w:id="42"/>
-    <w:bookmarkStart w:id="46" w:name="step-3---seam-waterproofing"/>
+          <w:numId w:val="1007"/>
+        </w:numPr>
+      </w:pPr>
+      <w:r>
+        <w:t xml:space="preserve">2 nails 1-½” below top</w:t>
+      </w:r>
+      <w:r>
+        <w:br/>
+      </w:r>
+      <w:r>
+        <w:t xml:space="preserve">— 1 nail in the middle of the board every 8”</w:t>
+      </w:r>
+      <w:r>
+        <w:br/>
+      </w:r>
+      <w:r>
+        <w:t xml:space="preserve">— 2 nails 1-½” above the bottom.</w:t>
+      </w:r>
+    </w:p>
+    <w:bookmarkEnd w:id="37"/>
+    <w:bookmarkStart w:id="38" w:name="X5ffa5d7bf4c6086ec0e57d6f2c8498a77ce06e8"/>
     <w:p>
       <w:pPr>
         <w:pStyle w:val="Heading2"/>
       </w:pPr>
       <w:r>
-        <w:t xml:space="preserve">Step 3 - Seam Waterproofing</w:t>
+        <w:t xml:space="preserve">Step 3 -- Side trim between window and door</w:t>
       </w:r>
     </w:p>
     <w:p>
@@ -895,28 +735,55 @@
         <w:pStyle w:val="Compact"/>
         <w:numPr>
           <w:ilvl w:val="0"/>
-          <w:numId w:val="1012"/>
-        </w:numPr>
-      </w:pPr>
-      <w:r>
-        <w:t xml:space="preserve">Cut a length of flexible flashing that will extend from below the ridge beam to 1” above the short leg of the Z-flashing</w:t>
-      </w:r>
-    </w:p>
-    <w:p>
-      <w:pPr>
-        <w:pStyle w:val="Compact"/>
-        <w:numPr>
-          <w:ilvl w:val="0"/>
-          <w:numId w:val="1012"/>
-        </w:numPr>
-      </w:pPr>
-      <w:r>
-        <w:t xml:space="preserve">Place the flexible flashing centered on the structural triangle, with the bottom edge 1” above the bend in the Z-flashing</w:t>
-      </w:r>
-    </w:p>
-    <w:p>
-      <w:r>
-        <w:br w:type="page"/>
+          <w:numId w:val="1008"/>
+        </w:numPr>
+      </w:pPr>
+      <w:r>
+        <w:t xml:space="preserve">Apply EXTERIOR caulk down the middle. Center and nail as above.</w:t>
+      </w:r>
+    </w:p>
+    <w:bookmarkEnd w:id="38"/>
+    <w:bookmarkStart w:id="42" w:name="step-4----bottom-piece"/>
+    <w:p>
+      <w:pPr>
+        <w:pStyle w:val="Heading2"/>
+      </w:pPr>
+      <w:r>
+        <w:t xml:space="preserve">Step 4 -- Bottom piece</w:t>
+      </w:r>
+    </w:p>
+    <w:p>
+      <w:pPr>
+        <w:numPr>
+          <w:ilvl w:val="0"/>
+          <w:numId w:val="1009"/>
+        </w:numPr>
+      </w:pPr>
+      <w:r>
+        <w:t xml:space="preserve">Measure between the two side pieces under the window, and cut a piece of 1x4 that length</w:t>
+      </w:r>
+    </w:p>
+    <w:p>
+      <w:pPr>
+        <w:numPr>
+          <w:ilvl w:val="0"/>
+          <w:numId w:val="1009"/>
+        </w:numPr>
+      </w:pPr>
+      <w:r>
+        <w:t xml:space="preserve">DO NOT CAULK this piece. Nail (PANEL NAILS) it in place</w:t>
+      </w:r>
+      <w:r>
+        <w:br/>
+      </w:r>
+      <w:r>
+        <w:t xml:space="preserve">— 2 nails 1-½” in from each end</w:t>
+      </w:r>
+      <w:r>
+        <w:br/>
+      </w:r>
+      <w:r>
+        <w:t xml:space="preserve">— 2 nails in the middle of the board</w:t>
       </w:r>
     </w:p>
     <w:p>
@@ -928,18 +795,18 @@
           <wp:inline>
             <wp:extent cx="5943600" cy="8229600"/>
             <wp:effectExtent b="0" l="0" r="0" t="0"/>
-            <wp:docPr descr="" title="" id="44" name="Picture"/>
+            <wp:docPr descr="" title="" id="40" name="Picture"/>
             <a:graphic>
               <a:graphicData uri="http://schemas.openxmlformats.org/drawingml/2006/picture">
                 <pic:pic>
                   <pic:nvPicPr>
-                    <pic:cNvPr descr="images/triangles_01.png" id="45" name="Picture"/>
+                    <pic:cNvPr descr="images/front_window.png" id="41" name="Picture"/>
                     <pic:cNvPicPr>
                       <a:picLocks noChangeArrowheads="1" noChangeAspect="1"/>
                     </pic:cNvPicPr>
                   </pic:nvPicPr>
                   <pic:blipFill>
-                    <a:blip r:embed="rId43"/>
+                    <a:blip r:embed="rId39"/>
                     <a:stretch>
                       <a:fillRect/>
                     </a:stretch>
@@ -966,143 +833,108 @@
         </w:drawing>
       </w:r>
     </w:p>
-    <w:bookmarkEnd w:id="46"/>
-    <w:bookmarkStart w:id="47" w:name="step-4---t1-11-triangles"/>
+    <w:bookmarkEnd w:id="42"/>
+    <w:bookmarkEnd w:id="43"/>
+    <w:bookmarkStart w:id="54" w:name="exterior-triangles---front-back"/>
+    <w:p>
+      <w:pPr>
+        <w:pStyle w:val="Heading1"/>
+      </w:pPr>
+      <w:r>
+        <w:t xml:space="preserve">EXTERIOR TRIANGLES - FRONT &amp; BACK</w:t>
+      </w:r>
+    </w:p>
+    <w:p>
+      <w:pPr>
+        <w:pStyle w:val="FirstParagraph"/>
+      </w:pPr>
+      <w:r>
+        <w:t xml:space="preserve">NOTE - Pre-cut Tyvek, metal flashing and triangle siding are on the back shelves near the white boards.</w:t>
+      </w:r>
+    </w:p>
+    <w:bookmarkStart w:id="44" w:name="step-1---tyvek"/>
     <w:p>
       <w:pPr>
         <w:pStyle w:val="Heading2"/>
       </w:pPr>
       <w:r>
-        <w:t xml:space="preserve">Step 4 - T1-11 Triangles</w:t>
-      </w:r>
-    </w:p>
-    <w:p>
-      <w:pPr>
-        <w:numPr>
-          <w:ilvl w:val="0"/>
-          <w:numId w:val="1013"/>
-        </w:numPr>
-      </w:pPr>
-      <w:r>
-        <w:t xml:space="preserve">Install first pre-cut triangular piece of T1-11 siding</w:t>
-      </w:r>
-      <w:r>
-        <w:br/>
-      </w:r>
-      <w:r>
-        <w:t xml:space="preserve">— cover long leg of Z- flashing</w:t>
-      </w:r>
-      <w:r>
-        <w:br/>
-      </w:r>
-      <w:r>
-        <w:t xml:space="preserve">— bottom of siding a pencil-width above the Z-flashing fold</w:t>
-      </w:r>
-      <w:r>
-        <w:br/>
-      </w:r>
-      <w:r>
-        <w:t xml:space="preserve">— if necessary, trim siding piece so that it fits against the structural triangle</w:t>
-      </w:r>
-      <w:r>
-        <w:br/>
-      </w:r>
-      <w:r>
-        <w:t xml:space="preserve">— Nail (Panel Nails) every 8” along rafter and bottom of triangle</w:t>
-      </w:r>
-    </w:p>
-    <w:p>
-      <w:pPr>
-        <w:numPr>
-          <w:ilvl w:val="0"/>
-          <w:numId w:val="1013"/>
-        </w:numPr>
-      </w:pPr>
-      <w:r>
-        <w:t xml:space="preserve">Install second pre-cut triangular piece of T1-11 siding</w:t>
-      </w:r>
-      <w:r>
-        <w:br/>
-      </w:r>
-      <w:r>
-        <w:t xml:space="preserve">— align grooves with the already-installed piece</w:t>
-      </w:r>
-      <w:r>
-        <w:br/>
-      </w:r>
-      <w:r>
-        <w:t xml:space="preserve">— make the center seam tight</w:t>
-      </w:r>
-      <w:r>
-        <w:br/>
-      </w:r>
-      <w:r>
-        <w:t xml:space="preserve">— Nail (Panel Nails) every 8” along rafter and bottom of triangle</w:t>
-      </w:r>
-    </w:p>
-    <w:p>
-      <w:pPr>
-        <w:numPr>
-          <w:ilvl w:val="0"/>
-          <w:numId w:val="1013"/>
-        </w:numPr>
-      </w:pPr>
-      <w:r>
-        <w:t xml:space="preserve">Caulk (EXTERIOR caulk) all exposed nails and center seam</w:t>
-      </w:r>
-    </w:p>
-    <w:bookmarkEnd w:id="47"/>
-    <w:bookmarkStart w:id="51" w:name="step-5-soffits"/>
+        <w:t xml:space="preserve">Step 1 - Tyvek</w:t>
+      </w:r>
+    </w:p>
+    <w:p>
+      <w:pPr>
+        <w:pStyle w:val="Compact"/>
+        <w:numPr>
+          <w:ilvl w:val="0"/>
+          <w:numId w:val="1010"/>
+        </w:numPr>
+      </w:pPr>
+      <w:r>
+        <w:t xml:space="preserve">Staple pre-cut Tyvek triangles to the structural triangle.</w:t>
+      </w:r>
+    </w:p>
+    <w:p>
+      <w:pPr>
+        <w:pStyle w:val="Compact"/>
+        <w:numPr>
+          <w:ilvl w:val="0"/>
+          <w:numId w:val="1010"/>
+        </w:numPr>
+      </w:pPr>
+      <w:r>
+        <w:t xml:space="preserve">Staple along top and bottom edges and down the center studs; hammer in all staples flush.</w:t>
+      </w:r>
+    </w:p>
+    <w:bookmarkEnd w:id="44"/>
+    <w:bookmarkStart w:id="48" w:name="step-2---z-flashing"/>
     <w:p>
       <w:pPr>
         <w:pStyle w:val="Heading2"/>
       </w:pPr>
       <w:r>
-        <w:t xml:space="preserve">Step 5 – Soffits</w:t>
-      </w:r>
-    </w:p>
-    <w:p>
-      <w:pPr>
-        <w:numPr>
-          <w:ilvl w:val="0"/>
-          <w:numId w:val="1014"/>
-        </w:numPr>
-      </w:pPr>
-      <w:r>
-        <w:t xml:space="preserve">Install precut soffit boards under rafters at each end of building.</w:t>
-      </w:r>
-    </w:p>
-    <w:p>
-      <w:pPr>
-        <w:numPr>
-          <w:ilvl w:val="0"/>
-          <w:numId w:val="1014"/>
-        </w:numPr>
-      </w:pPr>
-      <w:r>
-        <w:t xml:space="preserve">Mark location of cross blocks between rafters</w:t>
-      </w:r>
-    </w:p>
-    <w:p>
-      <w:pPr>
-        <w:numPr>
-          <w:ilvl w:val="0"/>
-          <w:numId w:val="1014"/>
-        </w:numPr>
-      </w:pPr>
-      <w:r>
-        <w:t xml:space="preserve">Position soffit board with angle-cut end tight against ridge beam and long edge tight against T1-11 siding. Trim as necessary to fit, so that soffit does not protrude past outside rafter.</w:t>
-      </w:r>
-    </w:p>
-    <w:p>
-      <w:pPr>
-        <w:numPr>
-          <w:ilvl w:val="0"/>
-          <w:numId w:val="1014"/>
-        </w:numPr>
-      </w:pPr>
-      <w:r>
-        <w:t xml:space="preserve">Nail (Panel Nails) 3 places into outside rafter, and one nail into each cross block</w:t>
+        <w:t xml:space="preserve">Step 2 - Z-Flashing</w:t>
+      </w:r>
+    </w:p>
+    <w:p>
+      <w:pPr>
+        <w:pStyle w:val="Compact"/>
+        <w:numPr>
+          <w:ilvl w:val="0"/>
+          <w:numId w:val="1011"/>
+        </w:numPr>
+      </w:pPr>
+      <w:r>
+        <w:t xml:space="preserve">Install pre-cut piece of metal flashing</w:t>
+      </w:r>
+      <w:r>
+        <w:br/>
+      </w:r>
+      <w:r>
+        <w:t xml:space="preserve">— short leg down so that flashing rests on top of the T1-11 siding at the top of the wall and the short leg extends down over the siding</w:t>
+      </w:r>
+    </w:p>
+    <w:p>
+      <w:pPr>
+        <w:pStyle w:val="Compact"/>
+        <w:numPr>
+          <w:ilvl w:val="0"/>
+          <w:numId w:val="1011"/>
+        </w:numPr>
+      </w:pPr>
+      <w:r>
+        <w:t xml:space="preserve">Center the flashing between the rafter ends</w:t>
+      </w:r>
+    </w:p>
+    <w:p>
+      <w:pPr>
+        <w:pStyle w:val="Compact"/>
+        <w:numPr>
+          <w:ilvl w:val="0"/>
+          <w:numId w:val="1011"/>
+        </w:numPr>
+      </w:pPr>
+      <w:r>
+        <w:t xml:space="preserve">Nail (PANEL NAILS) 3 places: near each end, and in middle</w:t>
       </w:r>
     </w:p>
     <w:p>
@@ -1119,18 +951,18 @@
           <wp:inline>
             <wp:extent cx="5943600" cy="8229600"/>
             <wp:effectExtent b="0" l="0" r="0" t="0"/>
-            <wp:docPr descr="" title="" id="49" name="Picture"/>
+            <wp:docPr descr="" title="" id="46" name="Picture"/>
             <a:graphic>
               <a:graphicData uri="http://schemas.openxmlformats.org/drawingml/2006/picture">
                 <pic:pic>
                   <pic:nvPicPr>
-                    <pic:cNvPr descr="images/triangles_02.png" id="50" name="Picture"/>
+                    <pic:cNvPr descr="images/triangles_01.png" id="47" name="Picture"/>
                     <pic:cNvPicPr>
                       <a:picLocks noChangeArrowheads="1" noChangeAspect="1"/>
                     </pic:cNvPicPr>
                   </pic:nvPicPr>
                   <pic:blipFill>
-                    <a:blip r:embed="rId48"/>
+                    <a:blip r:embed="rId45"/>
                     <a:stretch>
                       <a:fillRect/>
                     </a:stretch>
@@ -1157,8 +989,199 @@
         </w:drawing>
       </w:r>
     </w:p>
-    <w:bookmarkEnd w:id="51"/>
-    <w:bookmarkEnd w:id="52"/>
+    <w:bookmarkEnd w:id="48"/>
+    <w:bookmarkStart w:id="49" w:name="step-3---t1-11-triangles"/>
+    <w:p>
+      <w:pPr>
+        <w:pStyle w:val="Heading2"/>
+      </w:pPr>
+      <w:r>
+        <w:t xml:space="preserve">Step 3 - T1-11 Triangles</w:t>
+      </w:r>
+    </w:p>
+    <w:p>
+      <w:pPr>
+        <w:numPr>
+          <w:ilvl w:val="0"/>
+          <w:numId w:val="1012"/>
+        </w:numPr>
+      </w:pPr>
+      <w:r>
+        <w:t xml:space="preserve">Install large pre-cut triangular piece of T1-11 siding</w:t>
+      </w:r>
+      <w:r>
+        <w:br/>
+      </w:r>
+      <w:r>
+        <w:t xml:space="preserve">— cover long leg of Z-flashing</w:t>
+      </w:r>
+      <w:r>
+        <w:br/>
+      </w:r>
+      <w:r>
+        <w:t xml:space="preserve">— bottom of siding a pencil-width above the Z-flashing fold</w:t>
+      </w:r>
+      <w:r>
+        <w:br/>
+      </w:r>
+      <w:r>
+        <w:t xml:space="preserve">— if necessary, trim siding piece so that it fits against the structural triangle</w:t>
+      </w:r>
+      <w:r>
+        <w:br/>
+      </w:r>
+      <w:r>
+        <w:t xml:space="preserve">— Nail (Panel Nails) every 8” along rafters, bottom of triangle, and along center blocking.</w:t>
+      </w:r>
+    </w:p>
+    <w:p>
+      <w:pPr>
+        <w:numPr>
+          <w:ilvl w:val="0"/>
+          <w:numId w:val="1012"/>
+        </w:numPr>
+      </w:pPr>
+      <w:r>
+        <w:t xml:space="preserve">Install small pre-cut triangular piece of T1-11 siding</w:t>
+      </w:r>
+      <w:r>
+        <w:br/>
+      </w:r>
+      <w:r>
+        <w:t xml:space="preserve">— line up the bottom edges</w:t>
+      </w:r>
+      <w:r>
+        <w:br/>
+      </w:r>
+      <w:r>
+        <w:t xml:space="preserve">— make the seam tight</w:t>
+      </w:r>
+      <w:r>
+        <w:br/>
+      </w:r>
+      <w:r>
+        <w:t xml:space="preserve">— Nail (Panel Nails) in two places</w:t>
+      </w:r>
+    </w:p>
+    <w:p>
+      <w:pPr>
+        <w:numPr>
+          <w:ilvl w:val="0"/>
+          <w:numId w:val="1012"/>
+        </w:numPr>
+      </w:pPr>
+      <w:r>
+        <w:t xml:space="preserve">Caulk (EXTERIOR caulk) all exposed nails and seam</w:t>
+      </w:r>
+    </w:p>
+    <w:bookmarkEnd w:id="49"/>
+    <w:bookmarkStart w:id="53" w:name="step-4-soffits"/>
+    <w:p>
+      <w:pPr>
+        <w:pStyle w:val="Heading2"/>
+      </w:pPr>
+      <w:r>
+        <w:t xml:space="preserve">Step 4 – Soffits</w:t>
+      </w:r>
+    </w:p>
+    <w:p>
+      <w:pPr>
+        <w:numPr>
+          <w:ilvl w:val="0"/>
+          <w:numId w:val="1013"/>
+        </w:numPr>
+      </w:pPr>
+      <w:r>
+        <w:t xml:space="preserve">Install precut soffit boards under rafters at each end of building.</w:t>
+      </w:r>
+    </w:p>
+    <w:p>
+      <w:pPr>
+        <w:numPr>
+          <w:ilvl w:val="0"/>
+          <w:numId w:val="1013"/>
+        </w:numPr>
+      </w:pPr>
+      <w:r>
+        <w:t xml:space="preserve">Mark location of cross blocks between rafters</w:t>
+      </w:r>
+    </w:p>
+    <w:p>
+      <w:pPr>
+        <w:numPr>
+          <w:ilvl w:val="0"/>
+          <w:numId w:val="1013"/>
+        </w:numPr>
+      </w:pPr>
+      <w:r>
+        <w:t xml:space="preserve">Position soffit board with angle-cut end tight against ridge beam and long edge tight against T1-11 siding. Trim as necessary to fit, so that soffit does not protrude past outside rafter.</w:t>
+      </w:r>
+    </w:p>
+    <w:p>
+      <w:pPr>
+        <w:numPr>
+          <w:ilvl w:val="0"/>
+          <w:numId w:val="1013"/>
+        </w:numPr>
+      </w:pPr>
+      <w:r>
+        <w:t xml:space="preserve">Nail (Panel Nails) 3 places into outside rafter, and one nail into each cross block</w:t>
+      </w:r>
+    </w:p>
+    <w:p>
+      <w:r>
+        <w:br w:type="page"/>
+      </w:r>
+    </w:p>
+    <w:p>
+      <w:pPr>
+        <w:pStyle w:val="FirstParagraph"/>
+      </w:pPr>
+      <w:r>
+        <w:drawing>
+          <wp:inline>
+            <wp:extent cx="5943600" cy="8229600"/>
+            <wp:effectExtent b="0" l="0" r="0" t="0"/>
+            <wp:docPr descr="" title="" id="51" name="Picture"/>
+            <a:graphic>
+              <a:graphicData uri="http://schemas.openxmlformats.org/drawingml/2006/picture">
+                <pic:pic>
+                  <pic:nvPicPr>
+                    <pic:cNvPr descr="images/triangles_02.png" id="52" name="Picture"/>
+                    <pic:cNvPicPr>
+                      <a:picLocks noChangeArrowheads="1" noChangeAspect="1"/>
+                    </pic:cNvPicPr>
+                  </pic:nvPicPr>
+                  <pic:blipFill>
+                    <a:blip r:embed="rId50"/>
+                    <a:stretch>
+                      <a:fillRect/>
+                    </a:stretch>
+                  </pic:blipFill>
+                  <pic:spPr bwMode="auto">
+                    <a:xfrm>
+                      <a:off x="0" y="0"/>
+                      <a:ext cx="5943600" cy="8229600"/>
+                    </a:xfrm>
+                    <a:prstGeom prst="rect">
+                      <a:avLst/>
+                    </a:prstGeom>
+                    <a:noFill/>
+                    <a:ln w="9525">
+                      <a:noFill/>
+                      <a:headEnd/>
+                      <a:tailEnd/>
+                    </a:ln>
+                  </pic:spPr>
+                </pic:pic>
+              </a:graphicData>
+            </a:graphic>
+          </wp:inline>
+        </w:drawing>
+      </w:r>
+    </w:p>
+    <w:bookmarkEnd w:id="53"/>
+    <w:bookmarkEnd w:id="54"/>
     <w:sectPr>
       <w:headerReference r:id="rId9" w:type="even"/>
       <w:headerReference r:id="rId11" w:type="default"/>
@@ -1682,9 +1705,6 @@
     <w:abstractNumId w:val="991"/>
   </w:num>
   <w:num w:numId="1013">
-    <w:abstractNumId w:val="991"/>
-  </w:num>
-  <w:num w:numId="1014">
     <w:abstractNumId w:val="991"/>
   </w:num>
 </w:numbering>

</xml_diff>